<commit_message>
Update report: data quality analysis, electrode thickness issues, font styling
</commit_message>
<xml_diff>
--- a/PVD_Analysis_Report.docx
+++ b/PVD_Analysis_Report.docx
@@ -7,11 +7,19 @@
         <w:pStyle w:val="Title"/>
       </w:pPr>
       <w:r>
+        <w:rPr>
+          <w:rFonts w:ascii="Times New Roman" w:hAnsi="Times New Roman" w:eastAsia="Microsoft YaHei"/>
+          <w:b/>
+        </w:rPr>
         <w:t>PVD AlScN 工艺参数数据库 — 分析报告</w:t>
       </w:r>
     </w:p>
     <w:p>
       <w:r>
+        <w:rPr>
+          <w:rFonts w:ascii="Times New Roman" w:hAnsi="Times New Roman" w:eastAsia="Microsoft YaHei"/>
+          <w:sz w:val="21"/>
+        </w:rPr>
         <w:t>生成日期: 2026-05-14 | 数据版本: v2.3 | 129 样品 / 580 条电学曲线</w:t>
       </w:r>
     </w:p>
@@ -21,12 +29,21 @@
         <w:pStyle w:val="Heading1"/>
       </w:pPr>
       <w:r>
+        <w:rPr>
+          <w:rFonts w:ascii="Times New Roman" w:hAnsi="Times New Roman" w:eastAsia="Microsoft YaHei"/>
+          <w:b/>
+          <w:sz w:val="44"/>
+        </w:rPr>
         <w:t>1. 数据概况</w:t>
       </w:r>
     </w:p>
     <w:p>
       <w:r>
-        <w:t>本报告基于 AlScN PVD 工艺参数数据库 v2.3，包含 129 个样品的完整工艺参数 及 89 个样品的铁电电学测试数据（580 条 PE Loop 曲线）。数据覆盖 5 个实验批次 (P1-P5)，时间跨度 2026-03 至 2026-04。</w:t>
+        <w:rPr>
+          <w:rFonts w:ascii="Times New Roman" w:hAnsi="Times New Roman" w:eastAsia="Microsoft YaHei"/>
+          <w:sz w:val="21"/>
+        </w:rPr>
+        <w:t>本报告基于 AlScN PVD 工艺参数数据库 v2.3，包含 129 个样品的完整工艺参数及 89 个样品的铁电电学测试数据（580 条 PE Loop 曲线）。数据覆盖 5 个实验批次 (P1-P5)，时间跨度 2026-03 至 2026-04。</w:t>
       </w:r>
     </w:p>
     <w:p>
@@ -34,6 +51,11 @@
         <w:pStyle w:val="Heading2"/>
       </w:pPr>
       <w:r>
+        <w:rPr>
+          <w:rFonts w:ascii="Times New Roman" w:hAnsi="Times New Roman" w:eastAsia="Microsoft YaHei"/>
+          <w:b/>
+          <w:sz w:val="32"/>
+        </w:rPr>
         <w:t>1.1 批次分布</w:t>
       </w:r>
     </w:p>
@@ -57,9 +79,15 @@
             <w:tcW w:type="dxa" w:w="1728"/>
           </w:tcPr>
           <w:p>
+            <w:pPr>
+              <w:jc w:val="center"/>
+            </w:pPr>
+            <w:r/>
             <w:r>
               <w:rPr>
+                <w:rFonts w:ascii="Times New Roman" w:hAnsi="Times New Roman" w:eastAsia="Microsoft YaHei"/>
                 <w:b/>
+                <w:sz w:val="18"/>
               </w:rPr>
               <w:t>批次</w:t>
             </w:r>
@@ -70,9 +98,15 @@
             <w:tcW w:type="dxa" w:w="1728"/>
           </w:tcPr>
           <w:p>
+            <w:pPr>
+              <w:jc w:val="center"/>
+            </w:pPr>
+            <w:r/>
             <w:r>
               <w:rPr>
+                <w:rFonts w:ascii="Times New Roman" w:hAnsi="Times New Roman" w:eastAsia="Microsoft YaHei"/>
                 <w:b/>
+                <w:sz w:val="18"/>
               </w:rPr>
               <w:t>样品数</w:t>
             </w:r>
@@ -83,9 +117,15 @@
             <w:tcW w:type="dxa" w:w="1728"/>
           </w:tcPr>
           <w:p>
+            <w:pPr>
+              <w:jc w:val="center"/>
+            </w:pPr>
+            <w:r/>
             <w:r>
               <w:rPr>
+                <w:rFonts w:ascii="Times New Roman" w:hAnsi="Times New Roman" w:eastAsia="Microsoft YaHei"/>
                 <w:b/>
+                <w:sz w:val="18"/>
               </w:rPr>
               <w:t>编号范围</w:t>
             </w:r>
@@ -96,9 +136,15 @@
             <w:tcW w:type="dxa" w:w="1728"/>
           </w:tcPr>
           <w:p>
+            <w:pPr>
+              <w:jc w:val="center"/>
+            </w:pPr>
+            <w:r/>
             <w:r>
               <w:rPr>
+                <w:rFonts w:ascii="Times New Roman" w:hAnsi="Times New Roman" w:eastAsia="Microsoft YaHei"/>
                 <w:b/>
+                <w:sz w:val="18"/>
               </w:rPr>
               <w:t>有电学</w:t>
             </w:r>
@@ -109,9 +155,15 @@
             <w:tcW w:type="dxa" w:w="1728"/>
           </w:tcPr>
           <w:p>
+            <w:pPr>
+              <w:jc w:val="center"/>
+            </w:pPr>
+            <w:r/>
             <w:r>
               <w:rPr>
+                <w:rFonts w:ascii="Times New Roman" w:hAnsi="Times New Roman" w:eastAsia="Microsoft YaHei"/>
                 <w:b/>
+                <w:sz w:val="18"/>
               </w:rPr>
               <w:t>电学曲线数</w:t>
             </w:r>
@@ -124,7 +176,15 @@
             <w:tcW w:type="dxa" w:w="1728"/>
           </w:tcPr>
           <w:p>
+            <w:pPr>
+              <w:jc w:val="center"/>
+            </w:pPr>
+            <w:r/>
             <w:r>
+              <w:rPr>
+                <w:rFonts w:ascii="Times New Roman" w:hAnsi="Times New Roman" w:eastAsia="Microsoft YaHei"/>
+                <w:sz w:val="18"/>
+              </w:rPr>
               <w:t>P1</w:t>
             </w:r>
           </w:p>
@@ -134,7 +194,15 @@
             <w:tcW w:type="dxa" w:w="1728"/>
           </w:tcPr>
           <w:p>
+            <w:pPr>
+              <w:jc w:val="center"/>
+            </w:pPr>
+            <w:r/>
             <w:r>
+              <w:rPr>
+                <w:rFonts w:ascii="Times New Roman" w:hAnsi="Times New Roman" w:eastAsia="Microsoft YaHei"/>
+                <w:sz w:val="18"/>
+              </w:rPr>
               <w:t>20</w:t>
             </w:r>
           </w:p>
@@ -144,7 +212,15 @@
             <w:tcW w:type="dxa" w:w="1728"/>
           </w:tcPr>
           <w:p>
+            <w:pPr>
+              <w:jc w:val="center"/>
+            </w:pPr>
+            <w:r/>
             <w:r>
+              <w:rPr>
+                <w:rFonts w:ascii="Times New Roman" w:hAnsi="Times New Roman" w:eastAsia="Microsoft YaHei"/>
+                <w:sz w:val="18"/>
+              </w:rPr>
               <w:t>01-20</w:t>
             </w:r>
           </w:p>
@@ -154,7 +230,15 @@
             <w:tcW w:type="dxa" w:w="1728"/>
           </w:tcPr>
           <w:p>
+            <w:pPr>
+              <w:jc w:val="center"/>
+            </w:pPr>
+            <w:r/>
             <w:r>
+              <w:rPr>
+                <w:rFonts w:ascii="Times New Roman" w:hAnsi="Times New Roman" w:eastAsia="Microsoft YaHei"/>
+                <w:sz w:val="18"/>
+              </w:rPr>
               <w:t>11</w:t>
             </w:r>
           </w:p>
@@ -164,7 +248,15 @@
             <w:tcW w:type="dxa" w:w="1728"/>
           </w:tcPr>
           <w:p>
+            <w:pPr>
+              <w:jc w:val="center"/>
+            </w:pPr>
+            <w:r/>
             <w:r>
+              <w:rPr>
+                <w:rFonts w:ascii="Times New Roman" w:hAnsi="Times New Roman" w:eastAsia="Microsoft YaHei"/>
+                <w:sz w:val="18"/>
+              </w:rPr>
               <w:t>69</w:t>
             </w:r>
           </w:p>
@@ -176,7 +268,15 @@
             <w:tcW w:type="dxa" w:w="1728"/>
           </w:tcPr>
           <w:p>
+            <w:pPr>
+              <w:jc w:val="center"/>
+            </w:pPr>
+            <w:r/>
             <w:r>
+              <w:rPr>
+                <w:rFonts w:ascii="Times New Roman" w:hAnsi="Times New Roman" w:eastAsia="Microsoft YaHei"/>
+                <w:sz w:val="18"/>
+              </w:rPr>
               <w:t>P2</w:t>
             </w:r>
           </w:p>
@@ -186,7 +286,15 @@
             <w:tcW w:type="dxa" w:w="1728"/>
           </w:tcPr>
           <w:p>
+            <w:pPr>
+              <w:jc w:val="center"/>
+            </w:pPr>
+            <w:r/>
             <w:r>
+              <w:rPr>
+                <w:rFonts w:ascii="Times New Roman" w:hAnsi="Times New Roman" w:eastAsia="Microsoft YaHei"/>
+                <w:sz w:val="18"/>
+              </w:rPr>
               <w:t>20</w:t>
             </w:r>
           </w:p>
@@ -196,7 +304,15 @@
             <w:tcW w:type="dxa" w:w="1728"/>
           </w:tcPr>
           <w:p>
+            <w:pPr>
+              <w:jc w:val="center"/>
+            </w:pPr>
+            <w:r/>
             <w:r>
+              <w:rPr>
+                <w:rFonts w:ascii="Times New Roman" w:hAnsi="Times New Roman" w:eastAsia="Microsoft YaHei"/>
+                <w:sz w:val="18"/>
+              </w:rPr>
               <w:t>21-40</w:t>
             </w:r>
           </w:p>
@@ -206,7 +322,15 @@
             <w:tcW w:type="dxa" w:w="1728"/>
           </w:tcPr>
           <w:p>
+            <w:pPr>
+              <w:jc w:val="center"/>
+            </w:pPr>
+            <w:r/>
             <w:r>
+              <w:rPr>
+                <w:rFonts w:ascii="Times New Roman" w:hAnsi="Times New Roman" w:eastAsia="Microsoft YaHei"/>
+                <w:sz w:val="18"/>
+              </w:rPr>
               <w:t>16</w:t>
             </w:r>
           </w:p>
@@ -216,7 +340,15 @@
             <w:tcW w:type="dxa" w:w="1728"/>
           </w:tcPr>
           <w:p>
+            <w:pPr>
+              <w:jc w:val="center"/>
+            </w:pPr>
+            <w:r/>
             <w:r>
+              <w:rPr>
+                <w:rFonts w:ascii="Times New Roman" w:hAnsi="Times New Roman" w:eastAsia="Microsoft YaHei"/>
+                <w:sz w:val="18"/>
+              </w:rPr>
               <w:t>124</w:t>
             </w:r>
           </w:p>
@@ -228,7 +360,15 @@
             <w:tcW w:type="dxa" w:w="1728"/>
           </w:tcPr>
           <w:p>
+            <w:pPr>
+              <w:jc w:val="center"/>
+            </w:pPr>
+            <w:r/>
             <w:r>
+              <w:rPr>
+                <w:rFonts w:ascii="Times New Roman" w:hAnsi="Times New Roman" w:eastAsia="Microsoft YaHei"/>
+                <w:sz w:val="18"/>
+              </w:rPr>
               <w:t>P3</w:t>
             </w:r>
           </w:p>
@@ -238,7 +378,15 @@
             <w:tcW w:type="dxa" w:w="1728"/>
           </w:tcPr>
           <w:p>
+            <w:pPr>
+              <w:jc w:val="center"/>
+            </w:pPr>
+            <w:r/>
             <w:r>
+              <w:rPr>
+                <w:rFonts w:ascii="Times New Roman" w:hAnsi="Times New Roman" w:eastAsia="Microsoft YaHei"/>
+                <w:sz w:val="18"/>
+              </w:rPr>
               <w:t>20</w:t>
             </w:r>
           </w:p>
@@ -248,7 +396,15 @@
             <w:tcW w:type="dxa" w:w="1728"/>
           </w:tcPr>
           <w:p>
+            <w:pPr>
+              <w:jc w:val="center"/>
+            </w:pPr>
+            <w:r/>
             <w:r>
+              <w:rPr>
+                <w:rFonts w:ascii="Times New Roman" w:hAnsi="Times New Roman" w:eastAsia="Microsoft YaHei"/>
+                <w:sz w:val="18"/>
+              </w:rPr>
               <w:t>41-60</w:t>
             </w:r>
           </w:p>
@@ -258,7 +414,15 @@
             <w:tcW w:type="dxa" w:w="1728"/>
           </w:tcPr>
           <w:p>
+            <w:pPr>
+              <w:jc w:val="center"/>
+            </w:pPr>
+            <w:r/>
             <w:r>
+              <w:rPr>
+                <w:rFonts w:ascii="Times New Roman" w:hAnsi="Times New Roman" w:eastAsia="Microsoft YaHei"/>
+                <w:sz w:val="18"/>
+              </w:rPr>
               <w:t>14</w:t>
             </w:r>
           </w:p>
@@ -268,7 +432,15 @@
             <w:tcW w:type="dxa" w:w="1728"/>
           </w:tcPr>
           <w:p>
+            <w:pPr>
+              <w:jc w:val="center"/>
+            </w:pPr>
+            <w:r/>
             <w:r>
+              <w:rPr>
+                <w:rFonts w:ascii="Times New Roman" w:hAnsi="Times New Roman" w:eastAsia="Microsoft YaHei"/>
+                <w:sz w:val="18"/>
+              </w:rPr>
               <w:t>107</w:t>
             </w:r>
           </w:p>
@@ -280,7 +452,15 @@
             <w:tcW w:type="dxa" w:w="1728"/>
           </w:tcPr>
           <w:p>
+            <w:pPr>
+              <w:jc w:val="center"/>
+            </w:pPr>
+            <w:r/>
             <w:r>
+              <w:rPr>
+                <w:rFonts w:ascii="Times New Roman" w:hAnsi="Times New Roman" w:eastAsia="Microsoft YaHei"/>
+                <w:sz w:val="18"/>
+              </w:rPr>
               <w:t>P4</w:t>
             </w:r>
           </w:p>
@@ -290,7 +470,15 @@
             <w:tcW w:type="dxa" w:w="1728"/>
           </w:tcPr>
           <w:p>
+            <w:pPr>
+              <w:jc w:val="center"/>
+            </w:pPr>
+            <w:r/>
             <w:r>
+              <w:rPr>
+                <w:rFonts w:ascii="Times New Roman" w:hAnsi="Times New Roman" w:eastAsia="Microsoft YaHei"/>
+                <w:sz w:val="18"/>
+              </w:rPr>
               <w:t>20</w:t>
             </w:r>
           </w:p>
@@ -300,7 +488,15 @@
             <w:tcW w:type="dxa" w:w="1728"/>
           </w:tcPr>
           <w:p>
+            <w:pPr>
+              <w:jc w:val="center"/>
+            </w:pPr>
+            <w:r/>
             <w:r>
+              <w:rPr>
+                <w:rFonts w:ascii="Times New Roman" w:hAnsi="Times New Roman" w:eastAsia="Microsoft YaHei"/>
+                <w:sz w:val="18"/>
+              </w:rPr>
               <w:t>61-80</w:t>
             </w:r>
           </w:p>
@@ -310,7 +506,15 @@
             <w:tcW w:type="dxa" w:w="1728"/>
           </w:tcPr>
           <w:p>
+            <w:pPr>
+              <w:jc w:val="center"/>
+            </w:pPr>
+            <w:r/>
             <w:r>
+              <w:rPr>
+                <w:rFonts w:ascii="Times New Roman" w:hAnsi="Times New Roman" w:eastAsia="Microsoft YaHei"/>
+                <w:sz w:val="18"/>
+              </w:rPr>
               <w:t>17</w:t>
             </w:r>
           </w:p>
@@ -320,7 +524,15 @@
             <w:tcW w:type="dxa" w:w="1728"/>
           </w:tcPr>
           <w:p>
+            <w:pPr>
+              <w:jc w:val="center"/>
+            </w:pPr>
+            <w:r/>
             <w:r>
+              <w:rPr>
+                <w:rFonts w:ascii="Times New Roman" w:hAnsi="Times New Roman" w:eastAsia="Microsoft YaHei"/>
+                <w:sz w:val="18"/>
+              </w:rPr>
               <w:t>112</w:t>
             </w:r>
           </w:p>
@@ -332,7 +544,15 @@
             <w:tcW w:type="dxa" w:w="1728"/>
           </w:tcPr>
           <w:p>
+            <w:pPr>
+              <w:jc w:val="center"/>
+            </w:pPr>
+            <w:r/>
             <w:r>
+              <w:rPr>
+                <w:rFonts w:ascii="Times New Roman" w:hAnsi="Times New Roman" w:eastAsia="Microsoft YaHei"/>
+                <w:sz w:val="18"/>
+              </w:rPr>
               <w:t>P5</w:t>
             </w:r>
           </w:p>
@@ -342,7 +562,15 @@
             <w:tcW w:type="dxa" w:w="1728"/>
           </w:tcPr>
           <w:p>
+            <w:pPr>
+              <w:jc w:val="center"/>
+            </w:pPr>
+            <w:r/>
             <w:r>
+              <w:rPr>
+                <w:rFonts w:ascii="Times New Roman" w:hAnsi="Times New Roman" w:eastAsia="Microsoft YaHei"/>
+                <w:sz w:val="18"/>
+              </w:rPr>
               <w:t>49</w:t>
             </w:r>
           </w:p>
@@ -352,7 +580,15 @@
             <w:tcW w:type="dxa" w:w="1728"/>
           </w:tcPr>
           <w:p>
+            <w:pPr>
+              <w:jc w:val="center"/>
+            </w:pPr>
+            <w:r/>
             <w:r>
+              <w:rPr>
+                <w:rFonts w:ascii="Times New Roman" w:hAnsi="Times New Roman" w:eastAsia="Microsoft YaHei"/>
+                <w:sz w:val="18"/>
+              </w:rPr>
               <w:t>81-129</w:t>
             </w:r>
           </w:p>
@@ -362,7 +598,15 @@
             <w:tcW w:type="dxa" w:w="1728"/>
           </w:tcPr>
           <w:p>
+            <w:pPr>
+              <w:jc w:val="center"/>
+            </w:pPr>
+            <w:r/>
             <w:r>
+              <w:rPr>
+                <w:rFonts w:ascii="Times New Roman" w:hAnsi="Times New Roman" w:eastAsia="Microsoft YaHei"/>
+                <w:sz w:val="18"/>
+              </w:rPr>
               <w:t>31</w:t>
             </w:r>
           </w:p>
@@ -372,7 +616,15 @@
             <w:tcW w:type="dxa" w:w="1728"/>
           </w:tcPr>
           <w:p>
+            <w:pPr>
+              <w:jc w:val="center"/>
+            </w:pPr>
+            <w:r/>
             <w:r>
+              <w:rPr>
+                <w:rFonts w:ascii="Times New Roman" w:hAnsi="Times New Roman" w:eastAsia="Microsoft YaHei"/>
+                <w:sz w:val="18"/>
+              </w:rPr>
               <w:t>168</w:t>
             </w:r>
           </w:p>
@@ -384,7 +636,15 @@
             <w:tcW w:type="dxa" w:w="1728"/>
           </w:tcPr>
           <w:p>
+            <w:pPr>
+              <w:jc w:val="center"/>
+            </w:pPr>
+            <w:r/>
             <w:r>
+              <w:rPr>
+                <w:rFonts w:ascii="Times New Roman" w:hAnsi="Times New Roman" w:eastAsia="Microsoft YaHei"/>
+                <w:sz w:val="18"/>
+              </w:rPr>
               <w:t>合计</w:t>
             </w:r>
           </w:p>
@@ -394,7 +654,15 @@
             <w:tcW w:type="dxa" w:w="1728"/>
           </w:tcPr>
           <w:p>
+            <w:pPr>
+              <w:jc w:val="center"/>
+            </w:pPr>
+            <w:r/>
             <w:r>
+              <w:rPr>
+                <w:rFonts w:ascii="Times New Roman" w:hAnsi="Times New Roman" w:eastAsia="Microsoft YaHei"/>
+                <w:sz w:val="18"/>
+              </w:rPr>
               <w:t>129</w:t>
             </w:r>
           </w:p>
@@ -404,7 +672,15 @@
             <w:tcW w:type="dxa" w:w="1728"/>
           </w:tcPr>
           <w:p>
+            <w:pPr>
+              <w:jc w:val="center"/>
+            </w:pPr>
+            <w:r/>
             <w:r>
+              <w:rPr>
+                <w:rFonts w:ascii="Times New Roman" w:hAnsi="Times New Roman" w:eastAsia="Microsoft YaHei"/>
+                <w:sz w:val="18"/>
+              </w:rPr>
               <w:t>-</w:t>
             </w:r>
           </w:p>
@@ -414,7 +690,15 @@
             <w:tcW w:type="dxa" w:w="1728"/>
           </w:tcPr>
           <w:p>
+            <w:pPr>
+              <w:jc w:val="center"/>
+            </w:pPr>
+            <w:r/>
             <w:r>
+              <w:rPr>
+                <w:rFonts w:ascii="Times New Roman" w:hAnsi="Times New Roman" w:eastAsia="Microsoft YaHei"/>
+                <w:sz w:val="18"/>
+              </w:rPr>
               <w:t>89</w:t>
             </w:r>
           </w:p>
@@ -424,7 +708,15 @@
             <w:tcW w:type="dxa" w:w="1728"/>
           </w:tcPr>
           <w:p>
+            <w:pPr>
+              <w:jc w:val="center"/>
+            </w:pPr>
+            <w:r/>
             <w:r>
+              <w:rPr>
+                <w:rFonts w:ascii="Times New Roman" w:hAnsi="Times New Roman" w:eastAsia="Microsoft YaHei"/>
+                <w:sz w:val="18"/>
+              </w:rPr>
               <w:t>580</w:t>
             </w:r>
           </w:p>
@@ -476,40 +768,39 @@
         <w:pStyle w:val="Heading2"/>
       </w:pPr>
       <w:r>
+        <w:rPr>
+          <w:rFonts w:ascii="Times New Roman" w:hAnsi="Times New Roman" w:eastAsia="Microsoft YaHei"/>
+          <w:b/>
+          <w:sz w:val="32"/>
+        </w:rPr>
         <w:t>1.2 样品类型与电极</w:t>
       </w:r>
     </w:p>
     <w:p>
       <w:r>
         <w:rPr>
-          <w:b/>
+          <w:rFonts w:ascii="Times New Roman" w:hAnsi="Times New Roman" w:eastAsia="Microsoft YaHei"/>
+          <w:sz w:val="21"/>
         </w:rPr>
-        <w:t xml:space="preserve">样品类型: </w:t>
-      </w:r>
-      <w:r>
-        <w:t>器件 (97), 薄膜 (32)</w:t>
+        <w:t>样品类型: 器件 (97), 薄膜 (32)</w:t>
       </w:r>
     </w:p>
     <w:p>
       <w:r>
         <w:rPr>
-          <w:b/>
+          <w:rFonts w:ascii="Times New Roman" w:hAnsi="Times New Roman" w:eastAsia="Microsoft YaHei"/>
+          <w:sz w:val="21"/>
         </w:rPr>
-        <w:t xml:space="preserve">顶电极: </w:t>
-      </w:r>
-      <w:r>
-        <w:t>AI (56), Mo (35), (空) (31), W (6), TiN (1)</w:t>
+        <w:t>顶电极: AI (56), Mo (35), (空) (31), W (6), TiN (1)</w:t>
       </w:r>
     </w:p>
     <w:p>
       <w:r>
         <w:rPr>
-          <w:b/>
+          <w:rFonts w:ascii="Times New Roman" w:hAnsi="Times New Roman" w:eastAsia="Microsoft YaHei"/>
+          <w:sz w:val="21"/>
         </w:rPr>
-        <w:t xml:space="preserve">底电极: </w:t>
-      </w:r>
-      <w:r>
-        <w:t>Pt (62), Mo (46), (空) (19), Mo(110) (1), Pt(111) (1)</w:t>
+        <w:t>底电极: Pt (62), Mo (46), (空) (19), Mo(110) (1), Pt(111) (1)</w:t>
       </w:r>
     </w:p>
     <w:p>
@@ -517,6 +808,11 @@
         <w:pStyle w:val="Heading1"/>
       </w:pPr>
       <w:r>
+        <w:rPr>
+          <w:rFonts w:ascii="Times New Roman" w:hAnsi="Times New Roman" w:eastAsia="Microsoft YaHei"/>
+          <w:b/>
+          <w:sz w:val="44"/>
+        </w:rPr>
         <w:t>2. 工艺参数现状</w:t>
       </w:r>
     </w:p>
@@ -525,11 +821,20 @@
         <w:pStyle w:val="Heading2"/>
       </w:pPr>
       <w:r>
+        <w:rPr>
+          <w:rFonts w:ascii="Times New Roman" w:hAnsi="Times New Roman" w:eastAsia="Microsoft YaHei"/>
+          <w:b/>
+          <w:sz w:val="32"/>
+        </w:rPr>
         <w:t>2.1 参数分类</w:t>
       </w:r>
     </w:p>
     <w:p>
       <w:r>
+        <w:rPr>
+          <w:rFonts w:ascii="Times New Roman" w:hAnsi="Times New Roman" w:eastAsia="Microsoft YaHei"/>
+          <w:sz w:val="21"/>
+        </w:rPr>
         <w:t>21 个工艺参数按数据完整度分为 4 类：</w:t>
       </w:r>
     </w:p>
@@ -550,9 +855,15 @@
             <w:tcW w:type="dxa" w:w="2880"/>
           </w:tcPr>
           <w:p>
+            <w:pPr>
+              <w:jc w:val="center"/>
+            </w:pPr>
+            <w:r/>
             <w:r>
               <w:rPr>
+                <w:rFonts w:ascii="Times New Roman" w:hAnsi="Times New Roman" w:eastAsia="Microsoft YaHei"/>
                 <w:b/>
+                <w:sz w:val="18"/>
               </w:rPr>
               <w:t>分类</w:t>
             </w:r>
@@ -563,9 +874,15 @@
             <w:tcW w:type="dxa" w:w="2880"/>
           </w:tcPr>
           <w:p>
+            <w:pPr>
+              <w:jc w:val="center"/>
+            </w:pPr>
+            <w:r/>
             <w:r>
               <w:rPr>
+                <w:rFonts w:ascii="Times New Roman" w:hAnsi="Times New Roman" w:eastAsia="Microsoft YaHei"/>
                 <w:b/>
+                <w:sz w:val="18"/>
               </w:rPr>
               <w:t>参数</w:t>
             </w:r>
@@ -576,9 +893,15 @@
             <w:tcW w:type="dxa" w:w="2880"/>
           </w:tcPr>
           <w:p>
+            <w:pPr>
+              <w:jc w:val="center"/>
+            </w:pPr>
+            <w:r/>
             <w:r>
               <w:rPr>
+                <w:rFonts w:ascii="Times New Roman" w:hAnsi="Times New Roman" w:eastAsia="Microsoft YaHei"/>
                 <w:b/>
+                <w:sz w:val="18"/>
               </w:rPr>
               <w:t>说明</w:t>
             </w:r>
@@ -591,7 +914,15 @@
             <w:tcW w:type="dxa" w:w="2880"/>
           </w:tcPr>
           <w:p>
+            <w:pPr>
+              <w:jc w:val="center"/>
+            </w:pPr>
+            <w:r/>
             <w:r>
+              <w:rPr>
+                <w:rFonts w:ascii="Times New Roman" w:hAnsi="Times New Roman" w:eastAsia="Microsoft YaHei"/>
+                <w:sz w:val="18"/>
+              </w:rPr>
               <w:t>固定常量</w:t>
             </w:r>
           </w:p>
@@ -601,7 +932,15 @@
             <w:tcW w:type="dxa" w:w="2880"/>
           </w:tcPr>
           <w:p>
+            <w:pPr>
+              <w:jc w:val="center"/>
+            </w:pPr>
+            <w:r/>
             <w:r>
+              <w:rPr>
+                <w:rFonts w:ascii="Times New Roman" w:hAnsi="Times New Roman" w:eastAsia="Microsoft YaHei"/>
+                <w:sz w:val="18"/>
+              </w:rPr>
               <w:t>底电极厚度(100nm), 基底转速(10rpm), 靶距(8.8mm), 工作气压(0.5Pa)</w:t>
             </w:r>
           </w:p>
@@ -611,8 +950,16 @@
             <w:tcW w:type="dxa" w:w="2880"/>
           </w:tcPr>
           <w:p>
+            <w:pPr>
+              <w:jc w:val="center"/>
+            </w:pPr>
+            <w:r/>
             <w:r>
-              <w:t>零方差</w:t>
+              <w:rPr>
+                <w:rFonts w:ascii="Times New Roman" w:hAnsi="Times New Roman" w:eastAsia="Microsoft YaHei"/>
+                <w:sz w:val="18"/>
+              </w:rPr>
+              <w:t>零方差，所有样品一致</w:t>
             </w:r>
           </w:p>
         </w:tc>
@@ -623,7 +970,15 @@
             <w:tcW w:type="dxa" w:w="2880"/>
           </w:tcPr>
           <w:p>
+            <w:pPr>
+              <w:jc w:val="center"/>
+            </w:pPr>
+            <w:r/>
             <w:r>
+              <w:rPr>
+                <w:rFonts w:ascii="Times New Roman" w:hAnsi="Times New Roman" w:eastAsia="Microsoft YaHei"/>
+                <w:sz w:val="18"/>
+              </w:rPr>
               <w:t>离散档位</w:t>
             </w:r>
           </w:p>
@@ -633,8 +988,16 @@
             <w:tcW w:type="dxa" w:w="2880"/>
           </w:tcPr>
           <w:p>
+            <w:pPr>
+              <w:jc w:val="center"/>
+            </w:pPr>
+            <w:r/>
             <w:r>
-              <w:t>膜层厚度(60/80/100nm), 顶电极厚度(60/100nm), 本底真空(2档), 脉冲频率(40-49kHz)</w:t>
+              <w:rPr>
+                <w:rFonts w:ascii="Times New Roman" w:hAnsi="Times New Roman" w:eastAsia="Microsoft YaHei"/>
+                <w:sz w:val="18"/>
+              </w:rPr>
+              <w:t>膜层厚度(60/80/100nm), 本底真空(2档), 脉冲频率(40-49kHz), 预溅射时间(15/16min)</w:t>
             </w:r>
           </w:p>
         </w:tc>
@@ -643,7 +1006,15 @@
             <w:tcW w:type="dxa" w:w="2880"/>
           </w:tcPr>
           <w:p>
+            <w:pPr>
+              <w:jc w:val="center"/>
+            </w:pPr>
+            <w:r/>
             <w:r>
+              <w:rPr>
+                <w:rFonts w:ascii="Times New Roman" w:hAnsi="Times New Roman" w:eastAsia="Microsoft YaHei"/>
+                <w:sz w:val="18"/>
+              </w:rPr>
               <w:t>2-4个固定取值</w:t>
             </w:r>
           </w:p>
@@ -655,7 +1026,15 @@
             <w:tcW w:type="dxa" w:w="2880"/>
           </w:tcPr>
           <w:p>
+            <w:pPr>
+              <w:jc w:val="center"/>
+            </w:pPr>
+            <w:r/>
             <w:r>
+              <w:rPr>
+                <w:rFonts w:ascii="Times New Roman" w:hAnsi="Times New Roman" w:eastAsia="Microsoft YaHei"/>
+                <w:sz w:val="18"/>
+              </w:rPr>
               <w:t>实验变量</w:t>
             </w:r>
           </w:p>
@@ -665,8 +1044,16 @@
             <w:tcW w:type="dxa" w:w="2880"/>
           </w:tcPr>
           <w:p>
+            <w:pPr>
+              <w:jc w:val="center"/>
+            </w:pPr>
+            <w:r/>
             <w:r>
-              <w:t>Sc功率(20-100W), N2流量(4-100sccm), Ar流量(4-200sccm), AlSc功率(P4/P5新增), AlN功率(P5新增)</w:t>
+              <w:rPr>
+                <w:rFonts w:ascii="Times New Roman" w:hAnsi="Times New Roman" w:eastAsia="Microsoft YaHei"/>
+                <w:sz w:val="18"/>
+              </w:rPr>
+              <w:t>Sc功率(20-100W), N2流量(4-100sccm), Ar流量(4-200sccm), AlSc功率(P4/P5), AlN功率(P5)</w:t>
             </w:r>
           </w:p>
         </w:tc>
@@ -675,7 +1062,15 @@
             <w:tcW w:type="dxa" w:w="2880"/>
           </w:tcPr>
           <w:p>
+            <w:pPr>
+              <w:jc w:val="center"/>
+            </w:pPr>
+            <w:r/>
             <w:r>
+              <w:rPr>
+                <w:rFonts w:ascii="Times New Roman" w:hAnsi="Times New Roman" w:eastAsia="Microsoft YaHei"/>
+                <w:sz w:val="18"/>
+              </w:rPr>
               <w:t>宽范围连续变化</w:t>
             </w:r>
           </w:p>
@@ -687,7 +1082,15 @@
             <w:tcW w:type="dxa" w:w="2880"/>
           </w:tcPr>
           <w:p>
+            <w:pPr>
+              <w:jc w:val="center"/>
+            </w:pPr>
+            <w:r/>
             <w:r>
+              <w:rPr>
+                <w:rFonts w:ascii="Times New Roman" w:hAnsi="Times New Roman" w:eastAsia="Microsoft YaHei"/>
+                <w:sz w:val="18"/>
+              </w:rPr>
               <w:t>全部缺失</w:t>
             </w:r>
           </w:p>
@@ -697,7 +1100,15 @@
             <w:tcW w:type="dxa" w:w="2880"/>
           </w:tcPr>
           <w:p>
+            <w:pPr>
+              <w:jc w:val="center"/>
+            </w:pPr>
+            <w:r/>
             <w:r>
+              <w:rPr>
+                <w:rFonts w:ascii="Times New Roman" w:hAnsi="Times New Roman" w:eastAsia="Microsoft YaHei"/>
+                <w:sz w:val="18"/>
+              </w:rPr>
               <w:t>基底偏压, 溅射角度, 总功率, 放电电压, 放电电流, 占空比</w:t>
             </w:r>
           </w:p>
@@ -707,7 +1118,15 @@
             <w:tcW w:type="dxa" w:w="2880"/>
           </w:tcPr>
           <w:p>
+            <w:pPr>
+              <w:jc w:val="center"/>
+            </w:pPr>
+            <w:r/>
             <w:r>
+              <w:rPr>
+                <w:rFonts w:ascii="Times New Roman" w:hAnsi="Times New Roman" w:eastAsia="Microsoft YaHei"/>
+                <w:sz w:val="18"/>
+              </w:rPr>
               <w:t>129/129为空</w:t>
             </w:r>
           </w:p>
@@ -759,12 +1178,21 @@
         <w:pStyle w:val="Heading2"/>
       </w:pPr>
       <w:r>
+        <w:rPr>
+          <w:rFonts w:ascii="Times New Roman" w:hAnsi="Times New Roman" w:eastAsia="Microsoft YaHei"/>
+          <w:b/>
+          <w:sz w:val="32"/>
+        </w:rPr>
         <w:t>2.2 制备温度</w:t>
       </w:r>
     </w:p>
     <w:p>
       <w:r>
-        <w:t>有温度记录的样品: 129 个 (100%), 均值 388°C, 范围 [20, 500]°C. P5 批次因 Excel 表头变化（制备温度→制备温度(°C)）初版导入丢失全部温度数据，v2.3 已修复。</w:t>
+        <w:rPr>
+          <w:rFonts w:ascii="Times New Roman" w:hAnsi="Times New Roman" w:eastAsia="Microsoft YaHei"/>
+          <w:sz w:val="21"/>
+        </w:rPr>
+        <w:t>有温度记录的样品: 129 个 (100%), 均值 388 C, 范围 [20, 500] C. P5 批次因 Excel 表头变化（制备温度 -&gt; 制备温度(C)）初版导入丢失全部温度数据，v2.3 已修复。</w:t>
       </w:r>
     </w:p>
     <w:p>
@@ -808,15 +1236,46 @@
     </w:p>
     <w:p>
       <w:pPr>
+        <w:pStyle w:val="Heading2"/>
+      </w:pPr>
+      <w:r>
+        <w:rPr>
+          <w:rFonts w:ascii="Times New Roman" w:hAnsi="Times New Roman" w:eastAsia="Microsoft YaHei"/>
+          <w:b/>
+          <w:sz w:val="32"/>
+        </w:rPr>
+        <w:t>2.3 溅射源配置</w:t>
+      </w:r>
+    </w:p>
+    <w:p>
+      <w:r>
+        <w:rPr>
+          <w:rFonts w:ascii="Times New Roman" w:hAnsi="Times New Roman" w:eastAsia="Microsoft YaHei"/>
+          <w:sz w:val="21"/>
+        </w:rPr>
+        <w:t>P4/P5 批次引入了合金靶材，溅射源配置发生显著变化。AlSc 合金靶有数据 27 条，其中 27 条为纯合金靶（无单质 Al/Sc 功率），0 条为合金靶与单质靶混用。AlN 靶有数据 36 条，全部来自 P5 批次。</w:t>
+      </w:r>
+    </w:p>
+    <w:p>
+      <w:pPr>
         <w:pStyle w:val="Heading1"/>
       </w:pPr>
       <w:r>
+        <w:rPr>
+          <w:rFonts w:ascii="Times New Roman" w:hAnsi="Times New Roman" w:eastAsia="Microsoft YaHei"/>
+          <w:b/>
+          <w:sz w:val="44"/>
+        </w:rPr>
         <w:t>3. 批次差异</w:t>
       </w:r>
     </w:p>
     <w:p>
       <w:r>
-        <w:t>工艺参数在 5 个批次间呈现系统性变化。P5 批次更换了溅射设备（布劳恩 OPTIvap 5s → 中科唯实 JCP450-4），并引入了 AlSc 和 AlN 合金靶材，工艺窗口与其他批次不可直接对比。</w:t>
+        <w:rPr>
+          <w:rFonts w:ascii="Times New Roman" w:hAnsi="Times New Roman" w:eastAsia="Microsoft YaHei"/>
+          <w:sz w:val="21"/>
+        </w:rPr>
+        <w:t>工艺参数在 5 个批次间呈现系统性变化。P5 批次更换了溅射设备（布劳恩 OPTIvap 5s -&gt; 中科唯实 JCP450-4），并引入了 AlSc 和 AlN 合金靶材，工艺窗口与其他批次不可直接对比。</w:t>
       </w:r>
     </w:p>
     <w:p>
@@ -824,6 +1283,11 @@
         <w:pStyle w:val="Heading2"/>
       </w:pPr>
       <w:r>
+        <w:rPr>
+          <w:rFonts w:ascii="Times New Roman" w:hAnsi="Times New Roman" w:eastAsia="Microsoft YaHei"/>
+          <w:b/>
+          <w:sz w:val="32"/>
+        </w:rPr>
         <w:t>3.1 关键参数批次均值</w:t>
       </w:r>
     </w:p>
@@ -847,9 +1311,15 @@
             <w:tcW w:type="dxa" w:w="1440"/>
           </w:tcPr>
           <w:p>
+            <w:pPr>
+              <w:jc w:val="center"/>
+            </w:pPr>
+            <w:r/>
             <w:r>
               <w:rPr>
+                <w:rFonts w:ascii="Times New Roman" w:hAnsi="Times New Roman" w:eastAsia="Microsoft YaHei"/>
                 <w:b/>
+                <w:sz w:val="18"/>
               </w:rPr>
               <w:t>参数</w:t>
             </w:r>
@@ -860,9 +1330,15 @@
             <w:tcW w:type="dxa" w:w="1440"/>
           </w:tcPr>
           <w:p>
+            <w:pPr>
+              <w:jc w:val="center"/>
+            </w:pPr>
+            <w:r/>
             <w:r>
               <w:rPr>
+                <w:rFonts w:ascii="Times New Roman" w:hAnsi="Times New Roman" w:eastAsia="Microsoft YaHei"/>
                 <w:b/>
+                <w:sz w:val="18"/>
               </w:rPr>
               <w:t>P1</w:t>
             </w:r>
@@ -873,9 +1349,15 @@
             <w:tcW w:type="dxa" w:w="1440"/>
           </w:tcPr>
           <w:p>
+            <w:pPr>
+              <w:jc w:val="center"/>
+            </w:pPr>
+            <w:r/>
             <w:r>
               <w:rPr>
+                <w:rFonts w:ascii="Times New Roman" w:hAnsi="Times New Roman" w:eastAsia="Microsoft YaHei"/>
                 <w:b/>
+                <w:sz w:val="18"/>
               </w:rPr>
               <w:t>P2</w:t>
             </w:r>
@@ -886,9 +1368,15 @@
             <w:tcW w:type="dxa" w:w="1440"/>
           </w:tcPr>
           <w:p>
+            <w:pPr>
+              <w:jc w:val="center"/>
+            </w:pPr>
+            <w:r/>
             <w:r>
               <w:rPr>
+                <w:rFonts w:ascii="Times New Roman" w:hAnsi="Times New Roman" w:eastAsia="Microsoft YaHei"/>
                 <w:b/>
+                <w:sz w:val="18"/>
               </w:rPr>
               <w:t>P3</w:t>
             </w:r>
@@ -899,9 +1387,15 @@
             <w:tcW w:type="dxa" w:w="1440"/>
           </w:tcPr>
           <w:p>
+            <w:pPr>
+              <w:jc w:val="center"/>
+            </w:pPr>
+            <w:r/>
             <w:r>
               <w:rPr>
+                <w:rFonts w:ascii="Times New Roman" w:hAnsi="Times New Roman" w:eastAsia="Microsoft YaHei"/>
                 <w:b/>
+                <w:sz w:val="18"/>
               </w:rPr>
               <w:t>P4</w:t>
             </w:r>
@@ -912,9 +1406,15 @@
             <w:tcW w:type="dxa" w:w="1440"/>
           </w:tcPr>
           <w:p>
+            <w:pPr>
+              <w:jc w:val="center"/>
+            </w:pPr>
+            <w:r/>
             <w:r>
               <w:rPr>
+                <w:rFonts w:ascii="Times New Roman" w:hAnsi="Times New Roman" w:eastAsia="Microsoft YaHei"/>
                 <w:b/>
+                <w:sz w:val="18"/>
               </w:rPr>
               <w:t>P5</w:t>
             </w:r>
@@ -927,7 +1427,15 @@
             <w:tcW w:type="dxa" w:w="1440"/>
           </w:tcPr>
           <w:p>
+            <w:pPr>
+              <w:jc w:val="center"/>
+            </w:pPr>
+            <w:r/>
             <w:r>
+              <w:rPr>
+                <w:rFonts w:ascii="Times New Roman" w:hAnsi="Times New Roman" w:eastAsia="Microsoft YaHei"/>
+                <w:sz w:val="18"/>
+              </w:rPr>
               <w:t>Sc功率(W)</w:t>
             </w:r>
           </w:p>
@@ -937,7 +1445,15 @@
             <w:tcW w:type="dxa" w:w="1440"/>
           </w:tcPr>
           <w:p>
+            <w:pPr>
+              <w:jc w:val="center"/>
+            </w:pPr>
+            <w:r/>
             <w:r>
+              <w:rPr>
+                <w:rFonts w:ascii="Times New Roman" w:hAnsi="Times New Roman" w:eastAsia="Microsoft YaHei"/>
+                <w:sz w:val="18"/>
+              </w:rPr>
               <w:t>96.5</w:t>
             </w:r>
           </w:p>
@@ -947,7 +1463,15 @@
             <w:tcW w:type="dxa" w:w="1440"/>
           </w:tcPr>
           <w:p>
+            <w:pPr>
+              <w:jc w:val="center"/>
+            </w:pPr>
+            <w:r/>
             <w:r>
+              <w:rPr>
+                <w:rFonts w:ascii="Times New Roman" w:hAnsi="Times New Roman" w:eastAsia="Microsoft YaHei"/>
+                <w:sz w:val="18"/>
+              </w:rPr>
               <w:t>71.1</w:t>
             </w:r>
           </w:p>
@@ -957,7 +1481,15 @@
             <w:tcW w:type="dxa" w:w="1440"/>
           </w:tcPr>
           <w:p>
+            <w:pPr>
+              <w:jc w:val="center"/>
+            </w:pPr>
+            <w:r/>
             <w:r>
+              <w:rPr>
+                <w:rFonts w:ascii="Times New Roman" w:hAnsi="Times New Roman" w:eastAsia="Microsoft YaHei"/>
+                <w:sz w:val="18"/>
+              </w:rPr>
               <w:t>60.5</w:t>
             </w:r>
           </w:p>
@@ -967,7 +1499,15 @@
             <w:tcW w:type="dxa" w:w="1440"/>
           </w:tcPr>
           <w:p>
+            <w:pPr>
+              <w:jc w:val="center"/>
+            </w:pPr>
+            <w:r/>
             <w:r>
+              <w:rPr>
+                <w:rFonts w:ascii="Times New Roman" w:hAnsi="Times New Roman" w:eastAsia="Microsoft YaHei"/>
+                <w:sz w:val="18"/>
+              </w:rPr>
               <w:t>61.7</w:t>
             </w:r>
           </w:p>
@@ -977,7 +1517,15 @@
             <w:tcW w:type="dxa" w:w="1440"/>
           </w:tcPr>
           <w:p>
+            <w:pPr>
+              <w:jc w:val="center"/>
+            </w:pPr>
+            <w:r/>
             <w:r>
+              <w:rPr>
+                <w:rFonts w:ascii="Times New Roman" w:hAnsi="Times New Roman" w:eastAsia="Microsoft YaHei"/>
+                <w:sz w:val="18"/>
+              </w:rPr>
               <w:t>30.0</w:t>
             </w:r>
           </w:p>
@@ -989,7 +1537,15 @@
             <w:tcW w:type="dxa" w:w="1440"/>
           </w:tcPr>
           <w:p>
+            <w:pPr>
+              <w:jc w:val="center"/>
+            </w:pPr>
+            <w:r/>
             <w:r>
+              <w:rPr>
+                <w:rFonts w:ascii="Times New Roman" w:hAnsi="Times New Roman" w:eastAsia="Microsoft YaHei"/>
+                <w:sz w:val="18"/>
+              </w:rPr>
               <w:t>N2流量(sccm)</w:t>
             </w:r>
           </w:p>
@@ -999,7 +1555,15 @@
             <w:tcW w:type="dxa" w:w="1440"/>
           </w:tcPr>
           <w:p>
+            <w:pPr>
+              <w:jc w:val="center"/>
+            </w:pPr>
+            <w:r/>
             <w:r>
+              <w:rPr>
+                <w:rFonts w:ascii="Times New Roman" w:hAnsi="Times New Roman" w:eastAsia="Microsoft YaHei"/>
+                <w:sz w:val="18"/>
+              </w:rPr>
               <w:t>20.0</w:t>
             </w:r>
           </w:p>
@@ -1009,7 +1573,15 @@
             <w:tcW w:type="dxa" w:w="1440"/>
           </w:tcPr>
           <w:p>
+            <w:pPr>
+              <w:jc w:val="center"/>
+            </w:pPr>
+            <w:r/>
             <w:r>
+              <w:rPr>
+                <w:rFonts w:ascii="Times New Roman" w:hAnsi="Times New Roman" w:eastAsia="Microsoft YaHei"/>
+                <w:sz w:val="18"/>
+              </w:rPr>
               <w:t>12.2</w:t>
             </w:r>
           </w:p>
@@ -1019,7 +1591,15 @@
             <w:tcW w:type="dxa" w:w="1440"/>
           </w:tcPr>
           <w:p>
+            <w:pPr>
+              <w:jc w:val="center"/>
+            </w:pPr>
+            <w:r/>
             <w:r>
+              <w:rPr>
+                <w:rFonts w:ascii="Times New Roman" w:hAnsi="Times New Roman" w:eastAsia="Microsoft YaHei"/>
+                <w:sz w:val="18"/>
+              </w:rPr>
               <w:t>6.8</w:t>
             </w:r>
           </w:p>
@@ -1029,7 +1609,15 @@
             <w:tcW w:type="dxa" w:w="1440"/>
           </w:tcPr>
           <w:p>
+            <w:pPr>
+              <w:jc w:val="center"/>
+            </w:pPr>
+            <w:r/>
             <w:r>
+              <w:rPr>
+                <w:rFonts w:ascii="Times New Roman" w:hAnsi="Times New Roman" w:eastAsia="Microsoft YaHei"/>
+                <w:sz w:val="18"/>
+              </w:rPr>
               <w:t>8.2</w:t>
             </w:r>
           </w:p>
@@ -1039,7 +1627,15 @@
             <w:tcW w:type="dxa" w:w="1440"/>
           </w:tcPr>
           <w:p>
+            <w:pPr>
+              <w:jc w:val="center"/>
+            </w:pPr>
+            <w:r/>
             <w:r>
+              <w:rPr>
+                <w:rFonts w:ascii="Times New Roman" w:hAnsi="Times New Roman" w:eastAsia="Microsoft YaHei"/>
+                <w:sz w:val="18"/>
+              </w:rPr>
               <w:t>57.3</w:t>
             </w:r>
           </w:p>
@@ -1051,7 +1647,15 @@
             <w:tcW w:type="dxa" w:w="1440"/>
           </w:tcPr>
           <w:p>
+            <w:pPr>
+              <w:jc w:val="center"/>
+            </w:pPr>
+            <w:r/>
             <w:r>
+              <w:rPr>
+                <w:rFonts w:ascii="Times New Roman" w:hAnsi="Times New Roman" w:eastAsia="Microsoft YaHei"/>
+                <w:sz w:val="18"/>
+              </w:rPr>
               <w:t>Ar流量(sccm)</w:t>
             </w:r>
           </w:p>
@@ -1061,7 +1665,15 @@
             <w:tcW w:type="dxa" w:w="1440"/>
           </w:tcPr>
           <w:p>
+            <w:pPr>
+              <w:jc w:val="center"/>
+            </w:pPr>
+            <w:r/>
             <w:r>
+              <w:rPr>
+                <w:rFonts w:ascii="Times New Roman" w:hAnsi="Times New Roman" w:eastAsia="Microsoft YaHei"/>
+                <w:sz w:val="18"/>
+              </w:rPr>
               <w:t>8.4</w:t>
             </w:r>
           </w:p>
@@ -1071,7 +1683,15 @@
             <w:tcW w:type="dxa" w:w="1440"/>
           </w:tcPr>
           <w:p>
+            <w:pPr>
+              <w:jc w:val="center"/>
+            </w:pPr>
+            <w:r/>
             <w:r>
+              <w:rPr>
+                <w:rFonts w:ascii="Times New Roman" w:hAnsi="Times New Roman" w:eastAsia="Microsoft YaHei"/>
+                <w:sz w:val="18"/>
+              </w:rPr>
               <w:t>21.0</w:t>
             </w:r>
           </w:p>
@@ -1081,7 +1701,15 @@
             <w:tcW w:type="dxa" w:w="1440"/>
           </w:tcPr>
           <w:p>
+            <w:pPr>
+              <w:jc w:val="center"/>
+            </w:pPr>
+            <w:r/>
             <w:r>
+              <w:rPr>
+                <w:rFonts w:ascii="Times New Roman" w:hAnsi="Times New Roman" w:eastAsia="Microsoft YaHei"/>
+                <w:sz w:val="18"/>
+              </w:rPr>
               <w:t>20.0</w:t>
             </w:r>
           </w:p>
@@ -1091,7 +1719,15 @@
             <w:tcW w:type="dxa" w:w="1440"/>
           </w:tcPr>
           <w:p>
+            <w:pPr>
+              <w:jc w:val="center"/>
+            </w:pPr>
+            <w:r/>
             <w:r>
+              <w:rPr>
+                <w:rFonts w:ascii="Times New Roman" w:hAnsi="Times New Roman" w:eastAsia="Microsoft YaHei"/>
+                <w:sz w:val="18"/>
+              </w:rPr>
               <w:t>20.0</w:t>
             </w:r>
           </w:p>
@@ -1101,7 +1737,15 @@
             <w:tcW w:type="dxa" w:w="1440"/>
           </w:tcPr>
           <w:p>
+            <w:pPr>
+              <w:jc w:val="center"/>
+            </w:pPr>
+            <w:r/>
             <w:r>
+              <w:rPr>
+                <w:rFonts w:ascii="Times New Roman" w:hAnsi="Times New Roman" w:eastAsia="Microsoft YaHei"/>
+                <w:sz w:val="18"/>
+              </w:rPr>
               <w:t>96.1</w:t>
             </w:r>
           </w:p>
@@ -1113,7 +1757,15 @@
             <w:tcW w:type="dxa" w:w="1440"/>
           </w:tcPr>
           <w:p>
+            <w:pPr>
+              <w:jc w:val="center"/>
+            </w:pPr>
+            <w:r/>
             <w:r>
+              <w:rPr>
+                <w:rFonts w:ascii="Times New Roman" w:hAnsi="Times New Roman" w:eastAsia="Microsoft YaHei"/>
+                <w:sz w:val="18"/>
+              </w:rPr>
               <w:t>沉积时长(sec)</w:t>
             </w:r>
           </w:p>
@@ -1123,7 +1775,15 @@
             <w:tcW w:type="dxa" w:w="1440"/>
           </w:tcPr>
           <w:p>
+            <w:pPr>
+              <w:jc w:val="center"/>
+            </w:pPr>
+            <w:r/>
             <w:r>
+              <w:rPr>
+                <w:rFonts w:ascii="Times New Roman" w:hAnsi="Times New Roman" w:eastAsia="Microsoft YaHei"/>
+                <w:sz w:val="18"/>
+              </w:rPr>
               <w:t>2430.0</w:t>
             </w:r>
           </w:p>
@@ -1133,7 +1793,15 @@
             <w:tcW w:type="dxa" w:w="1440"/>
           </w:tcPr>
           <w:p>
+            <w:pPr>
+              <w:jc w:val="center"/>
+            </w:pPr>
+            <w:r/>
             <w:r>
+              <w:rPr>
+                <w:rFonts w:ascii="Times New Roman" w:hAnsi="Times New Roman" w:eastAsia="Microsoft YaHei"/>
+                <w:sz w:val="18"/>
+              </w:rPr>
               <w:t>3213.0</w:t>
             </w:r>
           </w:p>
@@ -1143,7 +1811,15 @@
             <w:tcW w:type="dxa" w:w="1440"/>
           </w:tcPr>
           <w:p>
+            <w:pPr>
+              <w:jc w:val="center"/>
+            </w:pPr>
+            <w:r/>
             <w:r>
+              <w:rPr>
+                <w:rFonts w:ascii="Times New Roman" w:hAnsi="Times New Roman" w:eastAsia="Microsoft YaHei"/>
+                <w:sz w:val="18"/>
+              </w:rPr>
               <w:t>3420.0</w:t>
             </w:r>
           </w:p>
@@ -1153,7 +1829,15 @@
             <w:tcW w:type="dxa" w:w="1440"/>
           </w:tcPr>
           <w:p>
+            <w:pPr>
+              <w:jc w:val="center"/>
+            </w:pPr>
+            <w:r/>
             <w:r>
+              <w:rPr>
+                <w:rFonts w:ascii="Times New Roman" w:hAnsi="Times New Roman" w:eastAsia="Microsoft YaHei"/>
+                <w:sz w:val="18"/>
+              </w:rPr>
               <w:t>3510.0</w:t>
             </w:r>
           </w:p>
@@ -1163,7 +1847,15 @@
             <w:tcW w:type="dxa" w:w="1440"/>
           </w:tcPr>
           <w:p>
+            <w:pPr>
+              <w:jc w:val="center"/>
+            </w:pPr>
+            <w:r/>
             <w:r>
+              <w:rPr>
+                <w:rFonts w:ascii="Times New Roman" w:hAnsi="Times New Roman" w:eastAsia="Microsoft YaHei"/>
+                <w:sz w:val="18"/>
+              </w:rPr>
               <w:t>3600.0</w:t>
             </w:r>
           </w:p>
@@ -1175,7 +1867,15 @@
             <w:tcW w:type="dxa" w:w="1440"/>
           </w:tcPr>
           <w:p>
+            <w:pPr>
+              <w:jc w:val="center"/>
+            </w:pPr>
+            <w:r/>
             <w:r>
+              <w:rPr>
+                <w:rFonts w:ascii="Times New Roman" w:hAnsi="Times New Roman" w:eastAsia="Microsoft YaHei"/>
+                <w:sz w:val="18"/>
+              </w:rPr>
               <w:t>制备温度(C)</w:t>
             </w:r>
           </w:p>
@@ -1185,7 +1885,15 @@
             <w:tcW w:type="dxa" w:w="1440"/>
           </w:tcPr>
           <w:p>
+            <w:pPr>
+              <w:jc w:val="center"/>
+            </w:pPr>
+            <w:r/>
             <w:r>
+              <w:rPr>
+                <w:rFonts w:ascii="Times New Roman" w:hAnsi="Times New Roman" w:eastAsia="Microsoft YaHei"/>
+                <w:sz w:val="18"/>
+              </w:rPr>
               <w:t>300.5</w:t>
             </w:r>
           </w:p>
@@ -1195,7 +1903,15 @@
             <w:tcW w:type="dxa" w:w="1440"/>
           </w:tcPr>
           <w:p>
+            <w:pPr>
+              <w:jc w:val="center"/>
+            </w:pPr>
+            <w:r/>
             <w:r>
+              <w:rPr>
+                <w:rFonts w:ascii="Times New Roman" w:hAnsi="Times New Roman" w:eastAsia="Microsoft YaHei"/>
+                <w:sz w:val="18"/>
+              </w:rPr>
               <w:t>387.5</w:t>
             </w:r>
           </w:p>
@@ -1205,7 +1921,15 @@
             <w:tcW w:type="dxa" w:w="1440"/>
           </w:tcPr>
           <w:p>
+            <w:pPr>
+              <w:jc w:val="center"/>
+            </w:pPr>
+            <w:r/>
             <w:r>
+              <w:rPr>
+                <w:rFonts w:ascii="Times New Roman" w:hAnsi="Times New Roman" w:eastAsia="Microsoft YaHei"/>
+                <w:sz w:val="18"/>
+              </w:rPr>
               <w:t>395.0</w:t>
             </w:r>
           </w:p>
@@ -1215,7 +1939,15 @@
             <w:tcW w:type="dxa" w:w="1440"/>
           </w:tcPr>
           <w:p>
+            <w:pPr>
+              <w:jc w:val="center"/>
+            </w:pPr>
+            <w:r/>
             <w:r>
+              <w:rPr>
+                <w:rFonts w:ascii="Times New Roman" w:hAnsi="Times New Roman" w:eastAsia="Microsoft YaHei"/>
+                <w:sz w:val="18"/>
+              </w:rPr>
               <w:t>362.5</w:t>
             </w:r>
           </w:p>
@@ -1225,7 +1957,15 @@
             <w:tcW w:type="dxa" w:w="1440"/>
           </w:tcPr>
           <w:p>
+            <w:pPr>
+              <w:jc w:val="center"/>
+            </w:pPr>
+            <w:r/>
             <w:r>
+              <w:rPr>
+                <w:rFonts w:ascii="Times New Roman" w:hAnsi="Times New Roman" w:eastAsia="Microsoft YaHei"/>
+                <w:sz w:val="18"/>
+              </w:rPr>
               <w:t>432.7</w:t>
             </w:r>
           </w:p>
@@ -1237,7 +1977,15 @@
             <w:tcW w:type="dxa" w:w="1440"/>
           </w:tcPr>
           <w:p>
+            <w:pPr>
+              <w:jc w:val="center"/>
+            </w:pPr>
+            <w:r/>
             <w:r>
+              <w:rPr>
+                <w:rFonts w:ascii="Times New Roman" w:hAnsi="Times New Roman" w:eastAsia="Microsoft YaHei"/>
+                <w:sz w:val="18"/>
+              </w:rPr>
               <w:t>膜厚(nm)</w:t>
             </w:r>
           </w:p>
@@ -1247,7 +1995,15 @@
             <w:tcW w:type="dxa" w:w="1440"/>
           </w:tcPr>
           <w:p>
+            <w:pPr>
+              <w:jc w:val="center"/>
+            </w:pPr>
+            <w:r/>
             <w:r>
+              <w:rPr>
+                <w:rFonts w:ascii="Times New Roman" w:hAnsi="Times New Roman" w:eastAsia="Microsoft YaHei"/>
+                <w:sz w:val="18"/>
+              </w:rPr>
               <w:t>100.0</w:t>
             </w:r>
           </w:p>
@@ -1257,7 +2013,15 @@
             <w:tcW w:type="dxa" w:w="1440"/>
           </w:tcPr>
           <w:p>
+            <w:pPr>
+              <w:jc w:val="center"/>
+            </w:pPr>
+            <w:r/>
             <w:r>
+              <w:rPr>
+                <w:rFonts w:ascii="Times New Roman" w:hAnsi="Times New Roman" w:eastAsia="Microsoft YaHei"/>
+                <w:sz w:val="18"/>
+              </w:rPr>
               <w:t>96.0</w:t>
             </w:r>
           </w:p>
@@ -1267,7 +2031,15 @@
             <w:tcW w:type="dxa" w:w="1440"/>
           </w:tcPr>
           <w:p>
+            <w:pPr>
+              <w:jc w:val="center"/>
+            </w:pPr>
+            <w:r/>
             <w:r>
+              <w:rPr>
+                <w:rFonts w:ascii="Times New Roman" w:hAnsi="Times New Roman" w:eastAsia="Microsoft YaHei"/>
+                <w:sz w:val="18"/>
+              </w:rPr>
               <w:t>94.0</w:t>
             </w:r>
           </w:p>
@@ -1277,7 +2049,15 @@
             <w:tcW w:type="dxa" w:w="1440"/>
           </w:tcPr>
           <w:p>
+            <w:pPr>
+              <w:jc w:val="center"/>
+            </w:pPr>
+            <w:r/>
             <w:r>
+              <w:rPr>
+                <w:rFonts w:ascii="Times New Roman" w:hAnsi="Times New Roman" w:eastAsia="Microsoft YaHei"/>
+                <w:sz w:val="18"/>
+              </w:rPr>
               <w:t>97.0</w:t>
             </w:r>
           </w:p>
@@ -1287,7 +2067,15 @@
             <w:tcW w:type="dxa" w:w="1440"/>
           </w:tcPr>
           <w:p>
+            <w:pPr>
+              <w:jc w:val="center"/>
+            </w:pPr>
+            <w:r/>
             <w:r>
+              <w:rPr>
+                <w:rFonts w:ascii="Times New Roman" w:hAnsi="Times New Roman" w:eastAsia="Microsoft YaHei"/>
+                <w:sz w:val="18"/>
+              </w:rPr>
               <w:t>100.0</w:t>
             </w:r>
           </w:p>
@@ -1297,7 +2085,11 @@
     <w:p/>
     <w:p>
       <w:r>
-        <w:t>趋势总结: 从 P1 到 P5，Sc 功率逐步降低 (96→30W)，N₂ 和 Ar 流量在 P5 急剧升高 (N₂: 20→57 sccm, Ar: 8→96 sccm)，沉积时长逐步延长 (2430→3600s)。P5 同时引入了 AlSc 合金靶 (27条数据) 和 AlN 靶 (36条数据)，溅射源配置显著不同。</w:t>
+        <w:rPr>
+          <w:rFonts w:ascii="Times New Roman" w:hAnsi="Times New Roman" w:eastAsia="Microsoft YaHei"/>
+          <w:sz w:val="21"/>
+        </w:rPr>
+        <w:t>趋势总结: 从 P1 到 P5，Sc 功率逐步降低 (96-&gt;30W)，N2 和 Ar 流量在 P5 急剧升高 (N2: 20-&gt;57 sccm, Ar: 8-&gt;96 sccm)，沉积时长逐步延长 (2430-&gt;3600s)。</w:t>
       </w:r>
     </w:p>
     <w:p>
@@ -1305,62 +2097,488 @@
         <w:pStyle w:val="Heading1"/>
       </w:pPr>
       <w:r>
-        <w:t>4. 数据问题与注意事项</w:t>
+        <w:rPr>
+          <w:rFonts w:ascii="Times New Roman" w:hAnsi="Times New Roman" w:eastAsia="Microsoft YaHei"/>
+          <w:b/>
+          <w:sz w:val="44"/>
+        </w:rPr>
+        <w:t>4. 数据质量问题与注意事项</w:t>
+      </w:r>
+    </w:p>
+    <w:p>
+      <w:pPr>
+        <w:pStyle w:val="Heading2"/>
+      </w:pPr>
+      <w:r>
+        <w:rPr>
+          <w:rFonts w:ascii="Times New Roman" w:hAnsi="Times New Roman" w:eastAsia="Microsoft YaHei"/>
+          <w:b/>
+          <w:sz w:val="32"/>
+        </w:rPr>
+        <w:t>4.1 电极厚度缺失</w:t>
       </w:r>
     </w:p>
     <w:p>
       <w:r>
         <w:rPr>
-          <w:b/>
+          <w:rFonts w:ascii="Times New Roman" w:hAnsi="Times New Roman" w:eastAsia="Microsoft YaHei"/>
+          <w:sz w:val="21"/>
         </w:rPr>
-        <w:t xml:space="preserve">40 个样品无电学数据 (31%): </w:t>
-      </w:r>
-      <w:r>
-        <w:t>P1 9个、P2 4个、P3 6个、P4 3个、P5 18个。这些为占位样品，相关电学测试尚未完成或数据未上传。</w:t>
+        <w:t>有底电极材料但无厚度记录: 21 个样品。涉及材料: Mo, Pt。</w:t>
       </w:r>
     </w:p>
     <w:p>
       <w:r>
         <w:rPr>
+          <w:rFonts w:ascii="Times New Roman" w:hAnsi="Times New Roman" w:eastAsia="Microsoft YaHei"/>
+          <w:sz w:val="21"/>
+        </w:rPr>
+        <w:t>有顶电极材料但无厚度记录: 0 个样品。</w:t>
+      </w:r>
+    </w:p>
+    <w:tbl>
+      <w:tblPr>
+        <w:tblStyle w:val="LightGrid-Accent1"/>
+        <w:tblW w:type="auto" w:w="0"/>
+        <w:tblLook w:firstColumn="1" w:firstRow="1" w:lastColumn="0" w:lastRow="0" w:noHBand="0" w:noVBand="1" w:val="04A0"/>
+      </w:tblPr>
+      <w:tblGrid>
+        <w:gridCol w:w="2880"/>
+        <w:gridCol w:w="2880"/>
+        <w:gridCol w:w="2880"/>
+      </w:tblGrid>
+      <w:tr>
+        <w:tc>
+          <w:tcPr>
+            <w:tcW w:type="dxa" w:w="2880"/>
+          </w:tcPr>
+          <w:p>
+            <w:pPr>
+              <w:jc w:val="center"/>
+            </w:pPr>
+            <w:r/>
+            <w:r>
+              <w:rPr>
+                <w:rFonts w:ascii="Times New Roman" w:hAnsi="Times New Roman" w:eastAsia="Microsoft YaHei"/>
+                <w:b/>
+                <w:sz w:val="18"/>
+              </w:rPr>
+              <w:t>批次</w:t>
+            </w:r>
+          </w:p>
+        </w:tc>
+        <w:tc>
+          <w:tcPr>
+            <w:tcW w:type="dxa" w:w="2880"/>
+          </w:tcPr>
+          <w:p>
+            <w:pPr>
+              <w:jc w:val="center"/>
+            </w:pPr>
+            <w:r/>
+            <w:r>
+              <w:rPr>
+                <w:rFonts w:ascii="Times New Roman" w:hAnsi="Times New Roman" w:eastAsia="Microsoft YaHei"/>
+                <w:b/>
+                <w:sz w:val="18"/>
+              </w:rPr>
+              <w:t>底电极厚度缺失</w:t>
+            </w:r>
+          </w:p>
+        </w:tc>
+        <w:tc>
+          <w:tcPr>
+            <w:tcW w:type="dxa" w:w="2880"/>
+          </w:tcPr>
+          <w:p>
+            <w:pPr>
+              <w:jc w:val="center"/>
+            </w:pPr>
+            <w:r/>
+            <w:r>
+              <w:rPr>
+                <w:rFonts w:ascii="Times New Roman" w:hAnsi="Times New Roman" w:eastAsia="Microsoft YaHei"/>
+                <w:b/>
+                <w:sz w:val="18"/>
+              </w:rPr>
+              <w:t>占比</w:t>
+            </w:r>
+          </w:p>
+        </w:tc>
+      </w:tr>
+      <w:tr>
+        <w:tc>
+          <w:tcPr>
+            <w:tcW w:type="dxa" w:w="2880"/>
+          </w:tcPr>
+          <w:p>
+            <w:pPr>
+              <w:jc w:val="center"/>
+            </w:pPr>
+            <w:r/>
+            <w:r>
+              <w:rPr>
+                <w:rFonts w:ascii="Times New Roman" w:hAnsi="Times New Roman" w:eastAsia="Microsoft YaHei"/>
+                <w:sz w:val="18"/>
+              </w:rPr>
+              <w:t>P2</w:t>
+            </w:r>
+          </w:p>
+        </w:tc>
+        <w:tc>
+          <w:tcPr>
+            <w:tcW w:type="dxa" w:w="2880"/>
+          </w:tcPr>
+          <w:p>
+            <w:pPr>
+              <w:jc w:val="center"/>
+            </w:pPr>
+            <w:r/>
+            <w:r>
+              <w:rPr>
+                <w:rFonts w:ascii="Times New Roman" w:hAnsi="Times New Roman" w:eastAsia="Microsoft YaHei"/>
+                <w:sz w:val="18"/>
+              </w:rPr>
+              <w:t>2</w:t>
+            </w:r>
+          </w:p>
+        </w:tc>
+        <w:tc>
+          <w:tcPr>
+            <w:tcW w:type="dxa" w:w="2880"/>
+          </w:tcPr>
+          <w:p>
+            <w:pPr>
+              <w:jc w:val="center"/>
+            </w:pPr>
+            <w:r/>
+            <w:r>
+              <w:rPr>
+                <w:rFonts w:ascii="Times New Roman" w:hAnsi="Times New Roman" w:eastAsia="Microsoft YaHei"/>
+                <w:sz w:val="18"/>
+              </w:rPr>
+              <w:t>10%</w:t>
+            </w:r>
+          </w:p>
+        </w:tc>
+      </w:tr>
+      <w:tr>
+        <w:tc>
+          <w:tcPr>
+            <w:tcW w:type="dxa" w:w="2880"/>
+          </w:tcPr>
+          <w:p>
+            <w:pPr>
+              <w:jc w:val="center"/>
+            </w:pPr>
+            <w:r/>
+            <w:r>
+              <w:rPr>
+                <w:rFonts w:ascii="Times New Roman" w:hAnsi="Times New Roman" w:eastAsia="Microsoft YaHei"/>
+                <w:sz w:val="18"/>
+              </w:rPr>
+              <w:t>P3</w:t>
+            </w:r>
+          </w:p>
+        </w:tc>
+        <w:tc>
+          <w:tcPr>
+            <w:tcW w:type="dxa" w:w="2880"/>
+          </w:tcPr>
+          <w:p>
+            <w:pPr>
+              <w:jc w:val="center"/>
+            </w:pPr>
+            <w:r/>
+            <w:r>
+              <w:rPr>
+                <w:rFonts w:ascii="Times New Roman" w:hAnsi="Times New Roman" w:eastAsia="Microsoft YaHei"/>
+                <w:sz w:val="18"/>
+              </w:rPr>
+              <w:t>6</w:t>
+            </w:r>
+          </w:p>
+        </w:tc>
+        <w:tc>
+          <w:tcPr>
+            <w:tcW w:type="dxa" w:w="2880"/>
+          </w:tcPr>
+          <w:p>
+            <w:pPr>
+              <w:jc w:val="center"/>
+            </w:pPr>
+            <w:r/>
+            <w:r>
+              <w:rPr>
+                <w:rFonts w:ascii="Times New Roman" w:hAnsi="Times New Roman" w:eastAsia="Microsoft YaHei"/>
+                <w:sz w:val="18"/>
+              </w:rPr>
+              <w:t>30%</w:t>
+            </w:r>
+          </w:p>
+        </w:tc>
+      </w:tr>
+      <w:tr>
+        <w:tc>
+          <w:tcPr>
+            <w:tcW w:type="dxa" w:w="2880"/>
+          </w:tcPr>
+          <w:p>
+            <w:pPr>
+              <w:jc w:val="center"/>
+            </w:pPr>
+            <w:r/>
+            <w:r>
+              <w:rPr>
+                <w:rFonts w:ascii="Times New Roman" w:hAnsi="Times New Roman" w:eastAsia="Microsoft YaHei"/>
+                <w:sz w:val="18"/>
+              </w:rPr>
+              <w:t>P4</w:t>
+            </w:r>
+          </w:p>
+        </w:tc>
+        <w:tc>
+          <w:tcPr>
+            <w:tcW w:type="dxa" w:w="2880"/>
+          </w:tcPr>
+          <w:p>
+            <w:pPr>
+              <w:jc w:val="center"/>
+            </w:pPr>
+            <w:r/>
+            <w:r>
+              <w:rPr>
+                <w:rFonts w:ascii="Times New Roman" w:hAnsi="Times New Roman" w:eastAsia="Microsoft YaHei"/>
+                <w:sz w:val="18"/>
+              </w:rPr>
+              <w:t>3</w:t>
+            </w:r>
+          </w:p>
+        </w:tc>
+        <w:tc>
+          <w:tcPr>
+            <w:tcW w:type="dxa" w:w="2880"/>
+          </w:tcPr>
+          <w:p>
+            <w:pPr>
+              <w:jc w:val="center"/>
+            </w:pPr>
+            <w:r/>
+            <w:r>
+              <w:rPr>
+                <w:rFonts w:ascii="Times New Roman" w:hAnsi="Times New Roman" w:eastAsia="Microsoft YaHei"/>
+                <w:sz w:val="18"/>
+              </w:rPr>
+              <w:t>15%</w:t>
+            </w:r>
+          </w:p>
+        </w:tc>
+      </w:tr>
+      <w:tr>
+        <w:tc>
+          <w:tcPr>
+            <w:tcW w:type="dxa" w:w="2880"/>
+          </w:tcPr>
+          <w:p>
+            <w:pPr>
+              <w:jc w:val="center"/>
+            </w:pPr>
+            <w:r/>
+            <w:r>
+              <w:rPr>
+                <w:rFonts w:ascii="Times New Roman" w:hAnsi="Times New Roman" w:eastAsia="Microsoft YaHei"/>
+                <w:sz w:val="18"/>
+              </w:rPr>
+              <w:t>P5</w:t>
+            </w:r>
+          </w:p>
+        </w:tc>
+        <w:tc>
+          <w:tcPr>
+            <w:tcW w:type="dxa" w:w="2880"/>
+          </w:tcPr>
+          <w:p>
+            <w:pPr>
+              <w:jc w:val="center"/>
+            </w:pPr>
+            <w:r/>
+            <w:r>
+              <w:rPr>
+                <w:rFonts w:ascii="Times New Roman" w:hAnsi="Times New Roman" w:eastAsia="Microsoft YaHei"/>
+                <w:sz w:val="18"/>
+              </w:rPr>
+              <w:t>10</w:t>
+            </w:r>
+          </w:p>
+        </w:tc>
+        <w:tc>
+          <w:tcPr>
+            <w:tcW w:type="dxa" w:w="2880"/>
+          </w:tcPr>
+          <w:p>
+            <w:pPr>
+              <w:jc w:val="center"/>
+            </w:pPr>
+            <w:r/>
+            <w:r>
+              <w:rPr>
+                <w:rFonts w:ascii="Times New Roman" w:hAnsi="Times New Roman" w:eastAsia="Microsoft YaHei"/>
+                <w:sz w:val="18"/>
+              </w:rPr>
+              <w:t>20%</w:t>
+            </w:r>
+          </w:p>
+        </w:tc>
+      </w:tr>
+      <w:tr>
+        <w:tc>
+          <w:tcPr>
+            <w:tcW w:type="dxa" w:w="2880"/>
+          </w:tcPr>
+          <w:p>
+            <w:pPr>
+              <w:jc w:val="center"/>
+            </w:pPr>
+            <w:r/>
+            <w:r>
+              <w:rPr>
+                <w:rFonts w:ascii="Times New Roman" w:hAnsi="Times New Roman" w:eastAsia="Microsoft YaHei"/>
+                <w:sz w:val="18"/>
+              </w:rPr>
+              <w:t>合计</w:t>
+            </w:r>
+          </w:p>
+        </w:tc>
+        <w:tc>
+          <w:tcPr>
+            <w:tcW w:type="dxa" w:w="2880"/>
+          </w:tcPr>
+          <w:p>
+            <w:pPr>
+              <w:jc w:val="center"/>
+            </w:pPr>
+            <w:r/>
+            <w:r>
+              <w:rPr>
+                <w:rFonts w:ascii="Times New Roman" w:hAnsi="Times New Roman" w:eastAsia="Microsoft YaHei"/>
+                <w:sz w:val="18"/>
+              </w:rPr>
+              <w:t>21</w:t>
+            </w:r>
+          </w:p>
+        </w:tc>
+        <w:tc>
+          <w:tcPr>
+            <w:tcW w:type="dxa" w:w="2880"/>
+          </w:tcPr>
+          <w:p>
+            <w:pPr>
+              <w:jc w:val="center"/>
+            </w:pPr>
+            <w:r/>
+            <w:r>
+              <w:rPr>
+                <w:rFonts w:ascii="Times New Roman" w:hAnsi="Times New Roman" w:eastAsia="Microsoft YaHei"/>
+                <w:sz w:val="18"/>
+              </w:rPr>
+              <w:t>16%</w:t>
+            </w:r>
+          </w:p>
+        </w:tc>
+      </w:tr>
+    </w:tbl>
+    <w:p/>
+    <w:p>
+      <w:r>
+        <w:rPr>
+          <w:rFonts w:ascii="Times New Roman" w:hAnsi="Times New Roman" w:eastAsia="Microsoft YaHei"/>
           <w:b/>
+          <w:sz w:val="21"/>
         </w:rPr>
-        <w:t xml:space="preserve">6 列工艺参数完全缺失: </w:t>
+        <w:t>P5 批次底电极厚度缺失最严重 (10/49, 20%)。这些样品的底电极材料为 Pt 或 Mo，表明电极确实存在但厚度未被记录。</w:t>
       </w:r>
+    </w:p>
+    <w:p>
+      <w:pPr>
+        <w:pStyle w:val="Heading2"/>
+      </w:pPr>
       <w:r>
-        <w:t>基底偏压、溅射角度、总功率、放电电压、放电电流、占空比 — 129/129 为空。这些参数在原始 Excel 中未被填写。</w:t>
+        <w:rPr>
+          <w:rFonts w:ascii="Times New Roman" w:hAnsi="Times New Roman" w:eastAsia="Microsoft YaHei"/>
+          <w:b/>
+          <w:sz w:val="32"/>
+        </w:rPr>
+        <w:t>4.2 溅射源功率数据不一致</w:t>
       </w:r>
     </w:p>
     <w:p>
       <w:r>
         <w:rPr>
-          <w:b/>
+          <w:rFonts w:ascii="Times New Roman" w:hAnsi="Times New Roman" w:eastAsia="Microsoft YaHei"/>
+          <w:sz w:val="21"/>
         </w:rPr>
-        <w:t xml:space="preserve">Al/Sc 功率数据仅 66/129 样品有: </w:t>
-      </w:r>
-      <w:r>
-        <w:t>其余为 NULL，部分样品使用合金靶 (AlSc/AlN) 替代单质靶。</w:t>
+        <w:t>Al/Sc 功率数据仅 66/129 样品有同时记录。36 个样品有 Sc 功率但无 Al 功率，推测使用了 AlSc 合金靶或 AlN 靶。27 个样品仅使用 AlSc 合金靶（无单质 Al/Sc 功率数据），这些数据无法直接与使用单质靶的样品进行功率对比。</w:t>
       </w:r>
     </w:p>
     <w:p>
+      <w:pPr>
+        <w:pStyle w:val="Heading2"/>
+      </w:pPr>
       <w:r>
         <w:rPr>
+          <w:rFonts w:ascii="Times New Roman" w:hAnsi="Times New Roman" w:eastAsia="Microsoft YaHei"/>
           <w:b/>
+          <w:sz w:val="32"/>
         </w:rPr>
-        <w:t xml:space="preserve">Excel 表头在不同批次间变化: </w:t>
-      </w:r>
-      <w:r>
-        <w:t>v2.3 已引入模糊列名匹配 (import_utils.py)，但仍需注意未来可能出现的新变体。导入时会打印未识别列的警告。</w:t>
+        <w:t>4.3 其他数据问题</w:t>
       </w:r>
     </w:p>
     <w:p>
+      <w:pPr>
+        <w:pStyle w:val="ListBullet"/>
+      </w:pPr>
       <w:r>
         <w:rPr>
-          <w:b/>
+          <w:rFonts w:ascii="Times New Roman" w:hAnsi="Times New Roman" w:eastAsia="Microsoft YaHei"/>
+          <w:sz w:val="20"/>
         </w:rPr>
-        <w:t xml:space="preserve">P5 批次工艺条件与其他批次不可直接对比: </w:t>
+        <w:t>40 个样品无电学数据 (31%): P1 9个、P2 4个、P3 6个、P4 3个、P5 18个。为占位样品，电学测试尚未完成。</w:t>
       </w:r>
+    </w:p>
+    <w:p>
+      <w:pPr>
+        <w:pStyle w:val="ListBullet"/>
+      </w:pPr>
       <w:r>
-        <w:t>设备更换 + 溅射源变化 + 气体流量窗口完全不同的组合效应无法解耦。</w:t>
+        <w:rPr>
+          <w:rFonts w:ascii="Times New Roman" w:hAnsi="Times New Roman" w:eastAsia="Microsoft YaHei"/>
+          <w:sz w:val="20"/>
+        </w:rPr>
+        <w:t>6 列工艺参数完全缺失 (129/129): 基底偏压、溅射角度、总功率、放电电压、放电电流、占空比。原始 Excel 未填写。</w:t>
+      </w:r>
+    </w:p>
+    <w:p>
+      <w:pPr>
+        <w:pStyle w:val="ListBullet"/>
+      </w:pPr>
+      <w:r>
+        <w:rPr>
+          <w:rFonts w:ascii="Times New Roman" w:hAnsi="Times New Roman" w:eastAsia="Microsoft YaHei"/>
+          <w:sz w:val="20"/>
+        </w:rPr>
+        <w:t>Excel 表头在不同批次间变化: 制备温度 vs 制备温度(C), 新增 AlSc(W)/电压, AlN(W)/电压 列。v2.3 已引入模糊列名匹配。</w:t>
+      </w:r>
+    </w:p>
+    <w:p>
+      <w:pPr>
+        <w:pStyle w:val="ListBullet"/>
+      </w:pPr>
+      <w:r>
+        <w:rPr>
+          <w:rFonts w:ascii="Times New Roman" w:hAnsi="Times New Roman" w:eastAsia="Microsoft YaHei"/>
+          <w:sz w:val="20"/>
+        </w:rPr>
+        <w:t>P5 批次工艺条件与其他批次不可直接对比: 设备更换 + 溅射源变化 + 气体流量窗口不同，组合效应无法解耦。</w:t>
       </w:r>
     </w:p>
     <w:p>
@@ -1368,11 +2586,20 @@
         <w:pStyle w:val="Heading1"/>
       </w:pPr>
       <w:r>
+        <w:rPr>
+          <w:rFonts w:ascii="Times New Roman" w:hAnsi="Times New Roman" w:eastAsia="Microsoft YaHei"/>
+          <w:b/>
+          <w:sz w:val="44"/>
+        </w:rPr>
         <w:t>5. 电学数据</w:t>
       </w:r>
     </w:p>
     <w:p>
       <w:r>
+        <w:rPr>
+          <w:rFonts w:ascii="Times New Roman" w:hAnsi="Times New Roman" w:eastAsia="Microsoft YaHei"/>
+          <w:sz w:val="21"/>
+        </w:rPr>
         <w:t>89 个样品有 PE Loop 铁电回线测试数据 (580 条曲线)。电学数据呈现多数量级分布 (Pmax: 0.0006 ~ 175,221 uC/cm2)，暗示存在不同物理机制的测量结果（正常铁电、漏电积分、器件击穿等）。</w:t>
       </w:r>
     </w:p>
@@ -1418,11 +2645,15 @@
     <w:p>
       <w:r>
         <w:rPr>
+          <w:rFonts w:ascii="Times New Roman" w:hAnsi="Times New Roman" w:eastAsia="Microsoft YaHei"/>
           <w:b/>
         </w:rPr>
         <w:t xml:space="preserve">当前阶段结论: </w:t>
       </w:r>
       <w:r>
+        <w:rPr>
+          <w:rFonts w:ascii="Times New Roman" w:hAnsi="Times New Roman" w:eastAsia="Microsoft YaHei"/>
+        </w:rPr>
         <w:t>由于电学数据中正常铁电信号与漏电/短路信号混合，且缺乏可靠的异常判据，现阶段无法对电学数据进行有意义的统计分析。建议后续工作首先建立基于回线形状的自动分类方法，或通过交叉验证（如 XRD 确认晶体质量）来标定"正常"样品，再基于标定结果进行工艺-性能关联分析。</w:t>
       </w:r>
     </w:p>
@@ -1432,6 +2663,9 @@
         <w:jc w:val="center"/>
       </w:pPr>
       <w:r>
+        <w:rPr>
+          <w:rFonts w:ascii="Times New Roman" w:hAnsi="Times New Roman" w:eastAsia="Microsoft YaHei"/>
+        </w:rPr>
         <w:t>— 报告结束 —</w:t>
       </w:r>
     </w:p>
@@ -1808,6 +3042,10 @@
     <w:name w:val="Normal"/>
     <w:qFormat/>
     <w:rsid w:val="00FC693F"/>
+    <w:rPr>
+      <w:rFonts w:ascii="Times New Roman" w:hAnsi="Times New Roman" w:eastAsia="Microsoft YaHei"/>
+      <w:sz w:val="21"/>
+    </w:rPr>
   </w:style>
   <w:style w:type="paragraph" w:styleId="Header">
     <w:name w:val="header"/>

</xml_diff>